<commit_message>
report updated (not final)
</commit_message>
<xml_diff>
--- a/3312lebedev&sharapov-lab01.docx
+++ b/3312lebedev&sharapov-lab01.docx
@@ -322,7 +322,7 @@
     </w:p>
     <w:p>
       <w:pPr>
-        <w:spacing w:after="2000"/>
+        <w:spacing w:after="1680"/>
         <w:ind w:firstLine="0"/>
         <w:jc w:val="left"/>
         <w:rPr>
@@ -372,7 +372,6 @@
           <w:bCs/>
           <w:szCs w:val="28"/>
         </w:rPr>
-        <w:lastRenderedPageBreak/>
         <w:t>202</w:t>
       </w:r>
       <w:r>
@@ -1198,36 +1197,12 @@
     </w:p>
     <w:p>
       <w:r>
-        <w:t xml:space="preserve">Доработать модуль shape.cpp, добавив в коллекцию ещё одну фигуру </w:t>
-      </w:r>
-      <w:r>
-        <w:t>–</w:t>
-      </w:r>
-      <w:r>
-        <w:t xml:space="preserve"> </w:t>
-      </w:r>
-      <w:r>
-        <w:t>косой крест</w:t>
-      </w:r>
-      <w:r>
-        <w:t>. Для этой фигуры нужно определить подходящее место в иерархии классов и написать недостающие функции-члены. Конструктор копии и другие генерируемые компилятором функции-члены, использование которых не предполагается, рекомендуется сделать недоступными.</w:t>
+        <w:t>Доработать модуль shape.cpp, добавив в коллекцию ещё одну фигуру – косой крест. Для этой фигуры нужно определить подходящее место в иерархии классов и написать недостающие функции-члены. Конструктор копии и другие генерируемые компилятором функции-члены, использование которых не предполагается, рекомендуется сделать недоступными.</w:t>
       </w:r>
     </w:p>
     <w:p>
       <w:r>
-        <w:t xml:space="preserve">Разработанной фигурой нужно дополнить картинку в указанных в позициях 1, </w:t>
-      </w:r>
-      <w:r>
-        <w:t>4</w:t>
-      </w:r>
-      <w:r>
-        <w:t xml:space="preserve">, </w:t>
-      </w:r>
-      <w:r>
-        <w:t>5</w:t>
-      </w:r>
-      <w:r>
-        <w:t>.</w:t>
+        <w:t>Разработанной фигурой нужно дополнить картинку в указанных в позициях 1, 4, 5.</w:t>
       </w:r>
     </w:p>
     <w:p>
@@ -1303,13 +1278,7 @@
     </w:p>
     <w:p>
       <w:r>
-        <w:t>2. результат подготовки фигур к сборке: изменение размеров, отражения, повороты; для вновь</w:t>
-      </w:r>
-      <w:r>
-        <w:t xml:space="preserve"> </w:t>
-      </w:r>
-      <w:r>
-        <w:t>добавленных фигур должны быть продемонстрированы все заложенные для них возможности для трансформации;</w:t>
+        <w:t>2. результат подготовки фигур к сборке: изменение размеров, отражения, повороты; для вновь добавленных фигур должны быть продемонстрированы все заложенные для них возможности для трансформации;</w:t>
       </w:r>
     </w:p>
     <w:p>
@@ -1335,7 +1304,6 @@
         <w:rPr>
           <w:b/>
           <w:bCs/>
-          <w:lang w:val="en-US"/>
         </w:rPr>
       </w:pPr>
       <w:r>
@@ -1349,7 +1317,6 @@
         <w:rPr>
           <w:b/>
           <w:bCs/>
-          <w:lang w:val="en-US"/>
         </w:rPr>
         <w:t>:</w:t>
       </w:r>
@@ -1637,10 +1604,22 @@
       <w:pPr>
         <w:pStyle w:val="1"/>
         <w:ind w:right="-1"/>
+        <w:rPr>
+          <w:lang w:val="en-US"/>
+        </w:rPr>
       </w:pPr>
       <w:bookmarkStart w:id="6" w:name="_Toc191321791"/>
       <w:r>
-        <w:t>Доработанный код</w:t>
+        <w:t>Доработанный</w:t>
+      </w:r>
+      <w:r>
+        <w:rPr>
+          <w:lang w:val="en-US"/>
+        </w:rPr>
+        <w:t xml:space="preserve"> </w:t>
+      </w:r>
+      <w:r>
+        <w:t>код</w:t>
       </w:r>
       <w:bookmarkEnd w:id="6"/>
     </w:p>
@@ -8154,13 +8133,7 @@
     </w:p>
     <w:p>
       <w:r>
-        <w:t>В ходе выполнения</w:t>
-      </w:r>
-      <w:r>
-        <w:t xml:space="preserve"> </w:t>
-      </w:r>
-      <w:r>
-        <w:t xml:space="preserve">работы была расширена иерархия классов, реализующих фигуры, за счет добавления нового класса </w:t>
+        <w:t xml:space="preserve">В ходе выполнения работы была расширена иерархия классов, реализующих фигуры, за счет добавления нового класса </w:t>
       </w:r>
       <w:r>
         <w:rPr>
@@ -8176,10 +8149,7 @@
     <w:p/>
     <w:p>
       <w:r>
-        <w:t xml:space="preserve">1. </w:t>
-      </w:r>
-      <w:r>
-        <w:t xml:space="preserve">Освоить принципы наследования и полиморфизма в C++, создавая производные классы от базового </w:t>
+        <w:t xml:space="preserve">1. Освоить принципы наследования и полиморфизма в C++, создавая производные классы от базового </w:t>
       </w:r>
       <w:r>
         <w:rPr>
@@ -8194,18 +8164,12 @@
     </w:p>
     <w:p>
       <w:r>
-        <w:t xml:space="preserve">2. </w:t>
-      </w:r>
-      <w:r>
-        <w:t>Реализовать новую фигуру, которая корректно отображается и взаимодействует с другими объектами в программе.</w:t>
+        <w:t>2. Реализовать новую фигуру, которая корректно отображается и взаимодействует с другими объектами в программе.</w:t>
       </w:r>
     </w:p>
     <w:p>
       <w:r>
-        <w:t xml:space="preserve">3. </w:t>
-      </w:r>
-      <w:r>
-        <w:t>Использовать переопределенные методы (</w:t>
+        <w:t>3. Использовать переопределенные методы (</w:t>
       </w:r>
       <w:r>
         <w:rPr>
@@ -8240,10 +8204,7 @@
     </w:p>
     <w:p>
       <w:r>
-        <w:t xml:space="preserve">4. </w:t>
-      </w:r>
-      <w:r>
-        <w:t>Обеспечить корректное размещение новой фигуры, разработав вспомогательные функции для позиционирования (</w:t>
+        <w:t>4. Обеспечить корректное размещение новой фигуры, разработав вспомогательные функции для позиционирования (</w:t>
       </w:r>
       <w:r>
         <w:rPr>
@@ -8288,10 +8249,7 @@
     </w:p>
     <w:p>
       <w:r>
-        <w:t xml:space="preserve">5. </w:t>
-      </w:r>
-      <w:r>
-        <w:t>Проверить работу программы в нескольких этапах:</w:t>
+        <w:t>5. Проверить работу программы в нескольких этапах:</w:t>
       </w:r>
     </w:p>
     <w:p>
@@ -8299,10 +8257,7 @@
         <w:ind w:left="707"/>
       </w:pPr>
       <w:r>
-        <w:t xml:space="preserve">- </w:t>
-      </w:r>
-      <w:r>
-        <w:t xml:space="preserve">Инициализация всех фигур, включая новый </w:t>
+        <w:t xml:space="preserve">- Инициализация всех фигур, включая новый </w:t>
       </w:r>
       <w:r>
         <w:rPr>
@@ -8320,10 +8275,7 @@
         <w:ind w:left="707"/>
       </w:pPr>
       <w:r>
-        <w:t xml:space="preserve">- </w:t>
-      </w:r>
-      <w:r>
-        <w:t>Демонстрация изменений размеров, перемещений и трансформаций.</w:t>
+        <w:t>- Демонстрация изменений размеров, перемещений и трансформаций.</w:t>
       </w:r>
     </w:p>
     <w:p>
@@ -8331,10 +8283,7 @@
         <w:ind w:left="707"/>
       </w:pPr>
       <w:r>
-        <w:t xml:space="preserve">- </w:t>
-      </w:r>
-      <w:r>
-        <w:t>Итоговая сборка изображения с добавленной фигурой в указанных позициях.</w:t>
+        <w:t>- Итоговая сборка изображения с добавленной фигурой в указанных позициях.</w:t>
       </w:r>
     </w:p>
     <w:p>

</xml_diff>